<commit_message>
Add test evidences for additional Bonus features
</commit_message>
<xml_diff>
--- a/EventLedgerApp Test Evidences.docx
+++ b/EventLedgerApp Test Evidences.docx
@@ -38,6 +38,509 @@
         <w:rPr>
           <w:lang w:val="en-GB"/>
         </w:rPr>
+        <w:t>=======================</w:t>
+      </w:r>
+      <w:r>
+        <w:rPr>
+          <w:lang w:val="en-GB"/>
+        </w:rPr>
+        <w:t>Bonus</w:t>
+      </w:r>
+      <w:r>
+        <w:rPr>
+          <w:lang w:val="en-GB"/>
+        </w:rPr>
+        <w:t xml:space="preserve"> Features Tests==========================</w:t>
+      </w:r>
+    </w:p>
+    <w:p>
+      <w:pPr>
+        <w:rPr>
+          <w:lang w:val="en-GB"/>
+        </w:rPr>
+      </w:pPr>
+      <w:r>
+        <w:rPr>
+          <w:lang w:val="en-GB"/>
+        </w:rPr>
+        <w:t xml:space="preserve">Test 1 – Invalid pagination inputs </w:t>
+      </w:r>
+    </w:p>
+    <w:p>
+      <w:pPr>
+        <w:rPr>
+          <w:lang w:val="en-GB"/>
+        </w:rPr>
+      </w:pPr>
+      <w:r>
+        <w:rPr>
+          <w:lang w:val="en-GB"/>
+        </w:rPr>
+        <w:t xml:space="preserve"> </w:t>
+      </w:r>
+      <w:r>
+        <w:rPr>
+          <w:noProof/>
+        </w:rPr>
+        <w:drawing>
+          <wp:inline distT="0" distB="0" distL="0" distR="0" wp14:anchorId="3E9A8C71" wp14:editId="35904FFA">
+            <wp:extent cx="5731510" cy="4589780"/>
+            <wp:effectExtent l="0" t="0" r="2540" b="1270"/>
+            <wp:docPr id="1456432124" name="Picture 1"/>
+            <wp:cNvGraphicFramePr>
+              <a:graphicFrameLocks xmlns:a="http://schemas.openxmlformats.org/drawingml/2006/main" noChangeAspect="1"/>
+            </wp:cNvGraphicFramePr>
+            <a:graphic xmlns:a="http://schemas.openxmlformats.org/drawingml/2006/main">
+              <a:graphicData uri="http://schemas.openxmlformats.org/drawingml/2006/picture">
+                <pic:pic xmlns:pic="http://schemas.openxmlformats.org/drawingml/2006/picture">
+                  <pic:nvPicPr>
+                    <pic:cNvPr id="1456432124" name=""/>
+                    <pic:cNvPicPr/>
+                  </pic:nvPicPr>
+                  <pic:blipFill>
+                    <a:blip r:embed="rId4"/>
+                    <a:stretch>
+                      <a:fillRect/>
+                    </a:stretch>
+                  </pic:blipFill>
+                  <pic:spPr>
+                    <a:xfrm>
+                      <a:off x="0" y="0"/>
+                      <a:ext cx="5731510" cy="4589780"/>
+                    </a:xfrm>
+                    <a:prstGeom prst="rect">
+                      <a:avLst/>
+                    </a:prstGeom>
+                  </pic:spPr>
+                </pic:pic>
+              </a:graphicData>
+            </a:graphic>
+          </wp:inline>
+        </w:drawing>
+      </w:r>
+    </w:p>
+    <w:p>
+      <w:pPr>
+        <w:rPr>
+          <w:lang w:val="en-GB"/>
+        </w:rPr>
+      </w:pPr>
+      <w:r>
+        <w:rPr>
+          <w:lang w:val="en-GB"/>
+        </w:rPr>
+        <w:t xml:space="preserve">Test </w:t>
+      </w:r>
+      <w:r>
+        <w:rPr>
+          <w:lang w:val="en-GB"/>
+        </w:rPr>
+        <w:t>2</w:t>
+      </w:r>
+      <w:r>
+        <w:rPr>
+          <w:lang w:val="en-GB"/>
+        </w:rPr>
+        <w:t xml:space="preserve"> – </w:t>
+      </w:r>
+      <w:r>
+        <w:rPr>
+          <w:lang w:val="en-GB"/>
+        </w:rPr>
+        <w:t>V</w:t>
+      </w:r>
+      <w:r>
+        <w:rPr>
+          <w:lang w:val="en-GB"/>
+        </w:rPr>
+        <w:t xml:space="preserve">alid pagination inputs </w:t>
+      </w:r>
+    </w:p>
+    <w:p>
+      <w:pPr>
+        <w:rPr>
+          <w:lang w:val="en-GB"/>
+        </w:rPr>
+      </w:pPr>
+      <w:r>
+        <w:rPr>
+          <w:noProof/>
+        </w:rPr>
+        <w:lastRenderedPageBreak/>
+        <w:drawing>
+          <wp:inline distT="0" distB="0" distL="0" distR="0" wp14:anchorId="36029589" wp14:editId="4F77949A">
+            <wp:extent cx="5731510" cy="4450715"/>
+            <wp:effectExtent l="0" t="0" r="2540" b="6985"/>
+            <wp:docPr id="981807377" name="Picture 1"/>
+            <wp:cNvGraphicFramePr>
+              <a:graphicFrameLocks xmlns:a="http://schemas.openxmlformats.org/drawingml/2006/main" noChangeAspect="1"/>
+            </wp:cNvGraphicFramePr>
+            <a:graphic xmlns:a="http://schemas.openxmlformats.org/drawingml/2006/main">
+              <a:graphicData uri="http://schemas.openxmlformats.org/drawingml/2006/picture">
+                <pic:pic xmlns:pic="http://schemas.openxmlformats.org/drawingml/2006/picture">
+                  <pic:nvPicPr>
+                    <pic:cNvPr id="981807377" name=""/>
+                    <pic:cNvPicPr/>
+                  </pic:nvPicPr>
+                  <pic:blipFill>
+                    <a:blip r:embed="rId5"/>
+                    <a:stretch>
+                      <a:fillRect/>
+                    </a:stretch>
+                  </pic:blipFill>
+                  <pic:spPr>
+                    <a:xfrm>
+                      <a:off x="0" y="0"/>
+                      <a:ext cx="5731510" cy="4450715"/>
+                    </a:xfrm>
+                    <a:prstGeom prst="rect">
+                      <a:avLst/>
+                    </a:prstGeom>
+                  </pic:spPr>
+                </pic:pic>
+              </a:graphicData>
+            </a:graphic>
+          </wp:inline>
+        </w:drawing>
+      </w:r>
+    </w:p>
+    <w:p>
+      <w:pPr>
+        <w:rPr>
+          <w:lang w:val="en-GB"/>
+        </w:rPr>
+      </w:pPr>
+    </w:p>
+    <w:p>
+      <w:pPr>
+        <w:rPr>
+          <w:lang w:val="en-GB"/>
+        </w:rPr>
+      </w:pPr>
+      <w:r>
+        <w:rPr>
+          <w:lang w:val="en-GB"/>
+        </w:rPr>
+        <w:t xml:space="preserve">Test 3 </w:t>
+      </w:r>
+      <w:r>
+        <w:rPr>
+          <w:lang w:val="en-GB"/>
+        </w:rPr>
+        <w:t xml:space="preserve">- </w:t>
+      </w:r>
+      <w:r>
+        <w:t>Dockerized setup (`docker compose up')</w:t>
+      </w:r>
+    </w:p>
+    <w:p>
+      <w:pPr>
+        <w:rPr>
+          <w:lang w:val="en-GB"/>
+        </w:rPr>
+      </w:pPr>
+      <w:r>
+        <w:rPr>
+          <w:noProof/>
+        </w:rPr>
+        <w:drawing>
+          <wp:inline distT="0" distB="0" distL="0" distR="0" wp14:anchorId="31BB0976" wp14:editId="5A813F67">
+            <wp:extent cx="5731510" cy="2933065"/>
+            <wp:effectExtent l="0" t="0" r="2540" b="635"/>
+            <wp:docPr id="953646523" name="Picture 1"/>
+            <wp:cNvGraphicFramePr>
+              <a:graphicFrameLocks xmlns:a="http://schemas.openxmlformats.org/drawingml/2006/main" noChangeAspect="1"/>
+            </wp:cNvGraphicFramePr>
+            <a:graphic xmlns:a="http://schemas.openxmlformats.org/drawingml/2006/main">
+              <a:graphicData uri="http://schemas.openxmlformats.org/drawingml/2006/picture">
+                <pic:pic xmlns:pic="http://schemas.openxmlformats.org/drawingml/2006/picture">
+                  <pic:nvPicPr>
+                    <pic:cNvPr id="953646523" name=""/>
+                    <pic:cNvPicPr/>
+                  </pic:nvPicPr>
+                  <pic:blipFill>
+                    <a:blip r:embed="rId6"/>
+                    <a:stretch>
+                      <a:fillRect/>
+                    </a:stretch>
+                  </pic:blipFill>
+                  <pic:spPr>
+                    <a:xfrm>
+                      <a:off x="0" y="0"/>
+                      <a:ext cx="5731510" cy="2933065"/>
+                    </a:xfrm>
+                    <a:prstGeom prst="rect">
+                      <a:avLst/>
+                    </a:prstGeom>
+                  </pic:spPr>
+                </pic:pic>
+              </a:graphicData>
+            </a:graphic>
+          </wp:inline>
+        </w:drawing>
+      </w:r>
+    </w:p>
+    <w:p>
+      <w:pPr>
+        <w:rPr>
+          <w:lang w:val="en-GB"/>
+        </w:rPr>
+      </w:pPr>
+    </w:p>
+    <w:p>
+      <w:pPr>
+        <w:rPr>
+          <w:lang w:val="en-GB"/>
+        </w:rPr>
+      </w:pPr>
+      <w:r>
+        <w:rPr>
+          <w:lang w:val="en-GB"/>
+        </w:rPr>
+        <w:t xml:space="preserve">Test 4 - </w:t>
+      </w:r>
+      <w:r>
+        <w:t>API documentation (Swagger/OpenAPI)</w:t>
+      </w:r>
+    </w:p>
+    <w:p>
+      <w:pPr>
+        <w:rPr>
+          <w:lang w:val="en-GB"/>
+        </w:rPr>
+      </w:pPr>
+      <w:r>
+        <w:rPr>
+          <w:noProof/>
+        </w:rPr>
+        <w:lastRenderedPageBreak/>
+        <w:drawing>
+          <wp:inline distT="0" distB="0" distL="0" distR="0" wp14:anchorId="01C9B05E" wp14:editId="22260F97">
+            <wp:extent cx="5731510" cy="2983865"/>
+            <wp:effectExtent l="0" t="0" r="2540" b="6985"/>
+            <wp:docPr id="2071833314" name="Picture 1"/>
+            <wp:cNvGraphicFramePr>
+              <a:graphicFrameLocks xmlns:a="http://schemas.openxmlformats.org/drawingml/2006/main" noChangeAspect="1"/>
+            </wp:cNvGraphicFramePr>
+            <a:graphic xmlns:a="http://schemas.openxmlformats.org/drawingml/2006/main">
+              <a:graphicData uri="http://schemas.openxmlformats.org/drawingml/2006/picture">
+                <pic:pic xmlns:pic="http://schemas.openxmlformats.org/drawingml/2006/picture">
+                  <pic:nvPicPr>
+                    <pic:cNvPr id="2071833314" name=""/>
+                    <pic:cNvPicPr/>
+                  </pic:nvPicPr>
+                  <pic:blipFill>
+                    <a:blip r:embed="rId7"/>
+                    <a:stretch>
+                      <a:fillRect/>
+                    </a:stretch>
+                  </pic:blipFill>
+                  <pic:spPr>
+                    <a:xfrm>
+                      <a:off x="0" y="0"/>
+                      <a:ext cx="5731510" cy="2983865"/>
+                    </a:xfrm>
+                    <a:prstGeom prst="rect">
+                      <a:avLst/>
+                    </a:prstGeom>
+                  </pic:spPr>
+                </pic:pic>
+              </a:graphicData>
+            </a:graphic>
+          </wp:inline>
+        </w:drawing>
+      </w:r>
+    </w:p>
+    <w:p>
+      <w:pPr>
+        <w:rPr>
+          <w:lang w:val="en-GB"/>
+        </w:rPr>
+      </w:pPr>
+      <w:r>
+        <w:rPr>
+          <w:noProof/>
+        </w:rPr>
+        <w:drawing>
+          <wp:inline distT="0" distB="0" distL="0" distR="0" wp14:anchorId="1B4B6DCB" wp14:editId="49EBDBAE">
+            <wp:extent cx="5731510" cy="3065145"/>
+            <wp:effectExtent l="0" t="0" r="2540" b="1905"/>
+            <wp:docPr id="1315881072" name="Picture 1"/>
+            <wp:cNvGraphicFramePr>
+              <a:graphicFrameLocks xmlns:a="http://schemas.openxmlformats.org/drawingml/2006/main" noChangeAspect="1"/>
+            </wp:cNvGraphicFramePr>
+            <a:graphic xmlns:a="http://schemas.openxmlformats.org/drawingml/2006/main">
+              <a:graphicData uri="http://schemas.openxmlformats.org/drawingml/2006/picture">
+                <pic:pic xmlns:pic="http://schemas.openxmlformats.org/drawingml/2006/picture">
+                  <pic:nvPicPr>
+                    <pic:cNvPr id="1315881072" name=""/>
+                    <pic:cNvPicPr/>
+                  </pic:nvPicPr>
+                  <pic:blipFill>
+                    <a:blip r:embed="rId8"/>
+                    <a:stretch>
+                      <a:fillRect/>
+                    </a:stretch>
+                  </pic:blipFill>
+                  <pic:spPr>
+                    <a:xfrm>
+                      <a:off x="0" y="0"/>
+                      <a:ext cx="5731510" cy="3065145"/>
+                    </a:xfrm>
+                    <a:prstGeom prst="rect">
+                      <a:avLst/>
+                    </a:prstGeom>
+                  </pic:spPr>
+                </pic:pic>
+              </a:graphicData>
+            </a:graphic>
+          </wp:inline>
+        </w:drawing>
+      </w:r>
+    </w:p>
+    <w:p>
+      <w:r>
+        <w:rPr>
+          <w:lang w:val="en-GB"/>
+        </w:rPr>
+        <w:t xml:space="preserve">Test 5 - </w:t>
+      </w:r>
+      <w:r>
+        <w:t>Concurrency handling (what happens with simultaneous POSTs for the same 'eventid?)</w:t>
+      </w:r>
+    </w:p>
+    <w:p>
+      <w:pPr>
+        <w:rPr>
+          <w:lang w:val="en-GB"/>
+        </w:rPr>
+      </w:pPr>
+      <w:r>
+        <w:rPr>
+          <w:lang w:val="en-GB"/>
+        </w:rPr>
+        <w:tab/>
+        <w:t xml:space="preserve">Added Junit test cases </w:t>
+      </w:r>
+    </w:p>
+    <w:p>
+      <w:pPr>
+        <w:rPr>
+          <w:lang w:val="en-GB"/>
+        </w:rPr>
+      </w:pPr>
+      <w:r>
+        <w:rPr>
+          <w:noProof/>
+        </w:rPr>
+        <w:lastRenderedPageBreak/>
+        <w:drawing>
+          <wp:inline distT="0" distB="0" distL="0" distR="0" wp14:anchorId="27684BE1" wp14:editId="5AA224BF">
+            <wp:extent cx="5731510" cy="2941320"/>
+            <wp:effectExtent l="0" t="0" r="2540" b="0"/>
+            <wp:docPr id="515689886" name="Picture 1"/>
+            <wp:cNvGraphicFramePr>
+              <a:graphicFrameLocks xmlns:a="http://schemas.openxmlformats.org/drawingml/2006/main" noChangeAspect="1"/>
+            </wp:cNvGraphicFramePr>
+            <a:graphic xmlns:a="http://schemas.openxmlformats.org/drawingml/2006/main">
+              <a:graphicData uri="http://schemas.openxmlformats.org/drawingml/2006/picture">
+                <pic:pic xmlns:pic="http://schemas.openxmlformats.org/drawingml/2006/picture">
+                  <pic:nvPicPr>
+                    <pic:cNvPr id="515689886" name=""/>
+                    <pic:cNvPicPr/>
+                  </pic:nvPicPr>
+                  <pic:blipFill>
+                    <a:blip r:embed="rId9"/>
+                    <a:stretch>
+                      <a:fillRect/>
+                    </a:stretch>
+                  </pic:blipFill>
+                  <pic:spPr>
+                    <a:xfrm>
+                      <a:off x="0" y="0"/>
+                      <a:ext cx="5731510" cy="2941320"/>
+                    </a:xfrm>
+                    <a:prstGeom prst="rect">
+                      <a:avLst/>
+                    </a:prstGeom>
+                  </pic:spPr>
+                </pic:pic>
+              </a:graphicData>
+            </a:graphic>
+          </wp:inline>
+        </w:drawing>
+      </w:r>
+    </w:p>
+    <w:p>
+      <w:pPr>
+        <w:rPr>
+          <w:lang w:val="en-GB"/>
+        </w:rPr>
+      </w:pPr>
+      <w:r>
+        <w:rPr>
+          <w:noProof/>
+        </w:rPr>
+        <w:drawing>
+          <wp:inline distT="0" distB="0" distL="0" distR="0" wp14:anchorId="240B6CEB" wp14:editId="18A52435">
+            <wp:extent cx="5731510" cy="2905760"/>
+            <wp:effectExtent l="0" t="0" r="2540" b="8890"/>
+            <wp:docPr id="343611330" name="Picture 1"/>
+            <wp:cNvGraphicFramePr>
+              <a:graphicFrameLocks xmlns:a="http://schemas.openxmlformats.org/drawingml/2006/main" noChangeAspect="1"/>
+            </wp:cNvGraphicFramePr>
+            <a:graphic xmlns:a="http://schemas.openxmlformats.org/drawingml/2006/main">
+              <a:graphicData uri="http://schemas.openxmlformats.org/drawingml/2006/picture">
+                <pic:pic xmlns:pic="http://schemas.openxmlformats.org/drawingml/2006/picture">
+                  <pic:nvPicPr>
+                    <pic:cNvPr id="343611330" name=""/>
+                    <pic:cNvPicPr/>
+                  </pic:nvPicPr>
+                  <pic:blipFill>
+                    <a:blip r:embed="rId10"/>
+                    <a:stretch>
+                      <a:fillRect/>
+                    </a:stretch>
+                  </pic:blipFill>
+                  <pic:spPr>
+                    <a:xfrm>
+                      <a:off x="0" y="0"/>
+                      <a:ext cx="5731510" cy="2905760"/>
+                    </a:xfrm>
+                    <a:prstGeom prst="rect">
+                      <a:avLst/>
+                    </a:prstGeom>
+                  </pic:spPr>
+                </pic:pic>
+              </a:graphicData>
+            </a:graphic>
+          </wp:inline>
+        </w:drawing>
+      </w:r>
+    </w:p>
+    <w:p>
+      <w:pPr>
+        <w:rPr>
+          <w:lang w:val="en-GB"/>
+        </w:rPr>
+      </w:pPr>
+      <w:r>
+        <w:rPr>
+          <w:lang w:val="en-GB"/>
+        </w:rPr>
+        <w:t>=======================Main Features Tests==========================</w:t>
+      </w:r>
+    </w:p>
+    <w:p>
+      <w:pPr>
+        <w:rPr>
+          <w:lang w:val="en-GB"/>
+        </w:rPr>
+      </w:pPr>
+      <w:r>
+        <w:rPr>
+          <w:lang w:val="en-GB"/>
+        </w:rPr>
         <w:t>Test 1 - submit a new event (expect 201)</w:t>
       </w:r>
     </w:p>
@@ -51,6 +554,7 @@
         <w:rPr>
           <w:noProof/>
         </w:rPr>
+        <w:lastRenderedPageBreak/>
         <w:drawing>
           <wp:inline distT="0" distB="0" distL="0" distR="0" wp14:anchorId="49535A7F" wp14:editId="4A9BC5E1">
             <wp:extent cx="5731510" cy="4565650"/>
@@ -67,7 +571,7 @@
                     <pic:cNvPicPr/>
                   </pic:nvPicPr>
                   <pic:blipFill>
-                    <a:blip r:embed="rId4"/>
+                    <a:blip r:embed="rId11"/>
                     <a:stretch>
                       <a:fillRect/>
                     </a:stretch>
@@ -128,7 +632,7 @@
                     <pic:cNvPicPr/>
                   </pic:nvPicPr>
                   <pic:blipFill>
-                    <a:blip r:embed="rId5"/>
+                    <a:blip r:embed="rId12"/>
                     <a:stretch>
                       <a:fillRect/>
                     </a:stretch>
@@ -195,7 +699,7 @@
                     <pic:cNvPicPr/>
                   </pic:nvPicPr>
                   <pic:blipFill>
-                    <a:blip r:embed="rId6"/>
+                    <a:blip r:embed="rId13"/>
                     <a:stretch>
                       <a:fillRect/>
                     </a:stretch>
@@ -262,7 +766,7 @@
                     <pic:cNvPicPr/>
                   </pic:nvPicPr>
                   <pic:blipFill>
-                    <a:blip r:embed="rId7"/>
+                    <a:blip r:embed="rId14"/>
                     <a:stretch>
                       <a:fillRect/>
                     </a:stretch>
@@ -323,7 +827,7 @@
                     <pic:cNvPicPr/>
                   </pic:nvPicPr>
                   <pic:blipFill>
-                    <a:blip r:embed="rId8"/>
+                    <a:blip r:embed="rId15"/>
                     <a:stretch>
                       <a:fillRect/>
                     </a:stretch>
@@ -404,7 +908,7 @@
                     <pic:cNvPicPr/>
                   </pic:nvPicPr>
                   <pic:blipFill>
-                    <a:blip r:embed="rId9"/>
+                    <a:blip r:embed="rId16"/>
                     <a:stretch>
                       <a:fillRect/>
                     </a:stretch>
@@ -471,7 +975,7 @@
                     <pic:cNvPicPr/>
                   </pic:nvPicPr>
                   <pic:blipFill>
-                    <a:blip r:embed="rId10"/>
+                    <a:blip r:embed="rId17"/>
                     <a:stretch>
                       <a:fillRect/>
                     </a:stretch>
@@ -538,7 +1042,7 @@
                     <pic:cNvPicPr/>
                   </pic:nvPicPr>
                   <pic:blipFill>
-                    <a:blip r:embed="rId11"/>
+                    <a:blip r:embed="rId18"/>
                     <a:stretch>
                       <a:fillRect/>
                     </a:stretch>
@@ -605,7 +1109,7 @@
                     <pic:cNvPicPr/>
                   </pic:nvPicPr>
                   <pic:blipFill>
-                    <a:blip r:embed="rId12"/>
+                    <a:blip r:embed="rId19"/>
                     <a:stretch>
                       <a:fillRect/>
                     </a:stretch>
@@ -672,7 +1176,7 @@
                     <pic:cNvPicPr/>
                   </pic:nvPicPr>
                   <pic:blipFill>
-                    <a:blip r:embed="rId13"/>
+                    <a:blip r:embed="rId20"/>
                     <a:stretch>
                       <a:fillRect/>
                     </a:stretch>
@@ -759,7 +1263,7 @@
                     <pic:cNvPicPr/>
                   </pic:nvPicPr>
                   <pic:blipFill>
-                    <a:blip r:embed="rId14"/>
+                    <a:blip r:embed="rId21"/>
                     <a:stretch>
                       <a:fillRect/>
                     </a:stretch>
@@ -838,7 +1342,7 @@
                     <pic:cNvPicPr/>
                   </pic:nvPicPr>
                   <pic:blipFill>
-                    <a:blip r:embed="rId15"/>
+                    <a:blip r:embed="rId22"/>
                     <a:stretch>
                       <a:fillRect/>
                     </a:stretch>
@@ -917,7 +1421,7 @@
                     <pic:cNvPicPr/>
                   </pic:nvPicPr>
                   <pic:blipFill>
-                    <a:blip r:embed="rId16"/>
+                    <a:blip r:embed="rId23"/>
                     <a:stretch>
                       <a:fillRect/>
                     </a:stretch>
@@ -985,7 +1489,7 @@
                     <pic:cNvPicPr/>
                   </pic:nvPicPr>
                   <pic:blipFill>
-                    <a:blip r:embed="rId17"/>
+                    <a:blip r:embed="rId24"/>
                     <a:stretch>
                       <a:fillRect/>
                     </a:stretch>
@@ -1046,7 +1550,7 @@
                     <pic:cNvPicPr/>
                   </pic:nvPicPr>
                   <pic:blipFill>
-                    <a:blip r:embed="rId18"/>
+                    <a:blip r:embed="rId25"/>
                     <a:stretch>
                       <a:fillRect/>
                     </a:stretch>
@@ -1094,7 +1598,7 @@
                     <pic:cNvPicPr/>
                   </pic:nvPicPr>
                   <pic:blipFill>
-                    <a:blip r:embed="rId19"/>
+                    <a:blip r:embed="rId26"/>
                     <a:stretch>
                       <a:fillRect/>
                     </a:stretch>
@@ -1155,7 +1659,7 @@
                     <pic:cNvPicPr/>
                   </pic:nvPicPr>
                   <pic:blipFill>
-                    <a:blip r:embed="rId20"/>
+                    <a:blip r:embed="rId27"/>
                     <a:stretch>
                       <a:fillRect/>
                     </a:stretch>
@@ -1586,6 +2090,7 @@
   <w:style w:type="paragraph" w:default="1" w:styleId="Normal">
     <w:name w:val="Normal"/>
     <w:qFormat/>
+    <w:rsid w:val="00395B62"/>
   </w:style>
   <w:style w:type="paragraph" w:styleId="Heading1">
     <w:name w:val="heading 1"/>

</xml_diff>

<commit_message>
Updated some comments and db constraints
</commit_message>
<xml_diff>
--- a/EventLedgerApp Test Evidences.docx
+++ b/EventLedgerApp Test Evidences.docx
@@ -38,19 +38,7 @@
         <w:rPr>
           <w:lang w:val="en-GB"/>
         </w:rPr>
-        <w:t>=======================</w:t>
-      </w:r>
-      <w:r>
-        <w:rPr>
-          <w:lang w:val="en-GB"/>
-        </w:rPr>
-        <w:t>Bonus</w:t>
-      </w:r>
-      <w:r>
-        <w:rPr>
-          <w:lang w:val="en-GB"/>
-        </w:rPr>
-        <w:t xml:space="preserve"> Features Tests==========================</w:t>
+        <w:t>=======================Bonus Features Tests==========================</w:t>
       </w:r>
     </w:p>
     <w:p>
@@ -129,31 +117,7 @@
         <w:rPr>
           <w:lang w:val="en-GB"/>
         </w:rPr>
-        <w:t xml:space="preserve">Test </w:t>
-      </w:r>
-      <w:r>
-        <w:rPr>
-          <w:lang w:val="en-GB"/>
-        </w:rPr>
-        <w:t>2</w:t>
-      </w:r>
-      <w:r>
-        <w:rPr>
-          <w:lang w:val="en-GB"/>
-        </w:rPr>
-        <w:t xml:space="preserve"> – </w:t>
-      </w:r>
-      <w:r>
-        <w:rPr>
-          <w:lang w:val="en-GB"/>
-        </w:rPr>
-        <w:t>V</w:t>
-      </w:r>
-      <w:r>
-        <w:rPr>
-          <w:lang w:val="en-GB"/>
-        </w:rPr>
-        <w:t xml:space="preserve">alid pagination inputs </w:t>
+        <w:t xml:space="preserve">Test 2 – Valid pagination inputs </w:t>
       </w:r>
     </w:p>
     <w:p>
@@ -168,10 +132,10 @@
         </w:rPr>
         <w:lastRenderedPageBreak/>
         <w:drawing>
-          <wp:inline distT="0" distB="0" distL="0" distR="0" wp14:anchorId="36029589" wp14:editId="4F77949A">
-            <wp:extent cx="5731510" cy="4450715"/>
-            <wp:effectExtent l="0" t="0" r="2540" b="6985"/>
-            <wp:docPr id="981807377" name="Picture 1"/>
+          <wp:inline distT="0" distB="0" distL="0" distR="0" wp14:anchorId="7509AD1B" wp14:editId="666BF505">
+            <wp:extent cx="5731510" cy="4681220"/>
+            <wp:effectExtent l="0" t="0" r="2540" b="5080"/>
+            <wp:docPr id="2128070265" name="Picture 1"/>
             <wp:cNvGraphicFramePr>
               <a:graphicFrameLocks xmlns:a="http://schemas.openxmlformats.org/drawingml/2006/main" noChangeAspect="1"/>
             </wp:cNvGraphicFramePr>
@@ -179,7 +143,7 @@
               <a:graphicData uri="http://schemas.openxmlformats.org/drawingml/2006/picture">
                 <pic:pic xmlns:pic="http://schemas.openxmlformats.org/drawingml/2006/picture">
                   <pic:nvPicPr>
-                    <pic:cNvPr id="981807377" name=""/>
+                    <pic:cNvPr id="2128070265" name=""/>
                     <pic:cNvPicPr/>
                   </pic:nvPicPr>
                   <pic:blipFill>
@@ -191,7 +155,55 @@
                   <pic:spPr>
                     <a:xfrm>
                       <a:off x="0" y="0"/>
-                      <a:ext cx="5731510" cy="4450715"/>
+                      <a:ext cx="5731510" cy="4681220"/>
+                    </a:xfrm>
+                    <a:prstGeom prst="rect">
+                      <a:avLst/>
+                    </a:prstGeom>
+                  </pic:spPr>
+                </pic:pic>
+              </a:graphicData>
+            </a:graphic>
+          </wp:inline>
+        </w:drawing>
+      </w:r>
+    </w:p>
+    <w:p>
+      <w:pPr>
+        <w:rPr>
+          <w:lang w:val="en-GB"/>
+        </w:rPr>
+      </w:pPr>
+      <w:r>
+        <w:rPr>
+          <w:noProof/>
+        </w:rPr>
+        <w:lastRenderedPageBreak/>
+        <w:drawing>
+          <wp:inline distT="0" distB="0" distL="0" distR="0" wp14:anchorId="39E5722F" wp14:editId="2E471B2A">
+            <wp:extent cx="5731510" cy="4840605"/>
+            <wp:effectExtent l="0" t="0" r="2540" b="0"/>
+            <wp:docPr id="1181864768" name="Picture 1"/>
+            <wp:cNvGraphicFramePr>
+              <a:graphicFrameLocks xmlns:a="http://schemas.openxmlformats.org/drawingml/2006/main" noChangeAspect="1"/>
+            </wp:cNvGraphicFramePr>
+            <a:graphic xmlns:a="http://schemas.openxmlformats.org/drawingml/2006/main">
+              <a:graphicData uri="http://schemas.openxmlformats.org/drawingml/2006/picture">
+                <pic:pic xmlns:pic="http://schemas.openxmlformats.org/drawingml/2006/picture">
+                  <pic:nvPicPr>
+                    <pic:cNvPr id="1181864768" name=""/>
+                    <pic:cNvPicPr/>
+                  </pic:nvPicPr>
+                  <pic:blipFill>
+                    <a:blip r:embed="rId6"/>
+                    <a:stretch>
+                      <a:fillRect/>
+                    </a:stretch>
+                  </pic:blipFill>
+                  <pic:spPr>
+                    <a:xfrm>
+                      <a:off x="0" y="0"/>
+                      <a:ext cx="5731510" cy="4840605"/>
                     </a:xfrm>
                     <a:prstGeom prst="rect">
                       <a:avLst/>
@@ -259,7 +271,7 @@
                     <pic:cNvPicPr/>
                   </pic:nvPicPr>
                   <pic:blipFill>
-                    <a:blip r:embed="rId6"/>
+                    <a:blip r:embed="rId7"/>
                     <a:stretch>
                       <a:fillRect/>
                     </a:stretch>
@@ -297,6 +309,7 @@
         <w:rPr>
           <w:lang w:val="en-GB"/>
         </w:rPr>
+        <w:lastRenderedPageBreak/>
         <w:t xml:space="preserve">Test 4 - </w:t>
       </w:r>
       <w:r>
@@ -313,7 +326,6 @@
         <w:rPr>
           <w:noProof/>
         </w:rPr>
-        <w:lastRenderedPageBreak/>
         <w:drawing>
           <wp:inline distT="0" distB="0" distL="0" distR="0" wp14:anchorId="01C9B05E" wp14:editId="22260F97">
             <wp:extent cx="5731510" cy="2983865"/>
@@ -330,7 +342,7 @@
                     <pic:cNvPicPr/>
                   </pic:nvPicPr>
                   <pic:blipFill>
-                    <a:blip r:embed="rId7"/>
+                    <a:blip r:embed="rId8"/>
                     <a:stretch>
                       <a:fillRect/>
                     </a:stretch>
@@ -377,7 +389,7 @@
                     <pic:cNvPicPr/>
                   </pic:nvPicPr>
                   <pic:blipFill>
-                    <a:blip r:embed="rId8"/>
+                    <a:blip r:embed="rId9"/>
                     <a:stretch>
                       <a:fillRect/>
                     </a:stretch>
@@ -450,7 +462,7 @@
                     <pic:cNvPicPr/>
                   </pic:nvPicPr>
                   <pic:blipFill>
-                    <a:blip r:embed="rId9"/>
+                    <a:blip r:embed="rId10"/>
                     <a:stretch>
                       <a:fillRect/>
                     </a:stretch>
@@ -497,7 +509,7 @@
                     <pic:cNvPicPr/>
                   </pic:nvPicPr>
                   <pic:blipFill>
-                    <a:blip r:embed="rId10"/>
+                    <a:blip r:embed="rId11"/>
                     <a:stretch>
                       <a:fillRect/>
                     </a:stretch>
@@ -571,7 +583,7 @@
                     <pic:cNvPicPr/>
                   </pic:nvPicPr>
                   <pic:blipFill>
-                    <a:blip r:embed="rId11"/>
+                    <a:blip r:embed="rId12"/>
                     <a:stretch>
                       <a:fillRect/>
                     </a:stretch>
@@ -632,7 +644,7 @@
                     <pic:cNvPicPr/>
                   </pic:nvPicPr>
                   <pic:blipFill>
-                    <a:blip r:embed="rId12"/>
+                    <a:blip r:embed="rId13"/>
                     <a:stretch>
                       <a:fillRect/>
                     </a:stretch>
@@ -699,7 +711,7 @@
                     <pic:cNvPicPr/>
                   </pic:nvPicPr>
                   <pic:blipFill>
-                    <a:blip r:embed="rId13"/>
+                    <a:blip r:embed="rId14"/>
                     <a:stretch>
                       <a:fillRect/>
                     </a:stretch>
@@ -743,7 +755,6 @@
         <w:rPr>
           <w:lang w:val="en-GB"/>
         </w:rPr>
-        <w:lastRenderedPageBreak/>
         <w:tab/>
       </w:r>
       <w:r>
@@ -766,7 +777,7 @@
                     <pic:cNvPicPr/>
                   </pic:nvPicPr>
                   <pic:blipFill>
-                    <a:blip r:embed="rId14"/>
+                    <a:blip r:embed="rId15"/>
                     <a:stretch>
                       <a:fillRect/>
                     </a:stretch>
@@ -827,7 +838,7 @@
                     <pic:cNvPicPr/>
                   </pic:nvPicPr>
                   <pic:blipFill>
-                    <a:blip r:embed="rId15"/>
+                    <a:blip r:embed="rId16"/>
                     <a:stretch>
                       <a:fillRect/>
                     </a:stretch>
@@ -908,7 +919,7 @@
                     <pic:cNvPicPr/>
                   </pic:nvPicPr>
                   <pic:blipFill>
-                    <a:blip r:embed="rId16"/>
+                    <a:blip r:embed="rId17"/>
                     <a:stretch>
                       <a:fillRect/>
                     </a:stretch>
@@ -975,7 +986,7 @@
                     <pic:cNvPicPr/>
                   </pic:nvPicPr>
                   <pic:blipFill>
-                    <a:blip r:embed="rId17"/>
+                    <a:blip r:embed="rId18"/>
                     <a:stretch>
                       <a:fillRect/>
                     </a:stretch>
@@ -1042,7 +1053,7 @@
                     <pic:cNvPicPr/>
                   </pic:nvPicPr>
                   <pic:blipFill>
-                    <a:blip r:embed="rId18"/>
+                    <a:blip r:embed="rId19"/>
                     <a:stretch>
                       <a:fillRect/>
                     </a:stretch>
@@ -1109,7 +1120,7 @@
                     <pic:cNvPicPr/>
                   </pic:nvPicPr>
                   <pic:blipFill>
-                    <a:blip r:embed="rId19"/>
+                    <a:blip r:embed="rId20"/>
                     <a:stretch>
                       <a:fillRect/>
                     </a:stretch>
@@ -1176,7 +1187,7 @@
                     <pic:cNvPicPr/>
                   </pic:nvPicPr>
                   <pic:blipFill>
-                    <a:blip r:embed="rId20"/>
+                    <a:blip r:embed="rId21"/>
                     <a:stretch>
                       <a:fillRect/>
                     </a:stretch>
@@ -1263,7 +1274,7 @@
                     <pic:cNvPicPr/>
                   </pic:nvPicPr>
                   <pic:blipFill>
-                    <a:blip r:embed="rId21"/>
+                    <a:blip r:embed="rId22"/>
                     <a:stretch>
                       <a:fillRect/>
                     </a:stretch>
@@ -1342,7 +1353,7 @@
                     <pic:cNvPicPr/>
                   </pic:nvPicPr>
                   <pic:blipFill>
-                    <a:blip r:embed="rId22"/>
+                    <a:blip r:embed="rId23"/>
                     <a:stretch>
                       <a:fillRect/>
                     </a:stretch>
@@ -1421,7 +1432,7 @@
                     <pic:cNvPicPr/>
                   </pic:nvPicPr>
                   <pic:blipFill>
-                    <a:blip r:embed="rId23"/>
+                    <a:blip r:embed="rId24"/>
                     <a:stretch>
                       <a:fillRect/>
                     </a:stretch>
@@ -1489,7 +1500,7 @@
                     <pic:cNvPicPr/>
                   </pic:nvPicPr>
                   <pic:blipFill>
-                    <a:blip r:embed="rId24"/>
+                    <a:blip r:embed="rId25"/>
                     <a:stretch>
                       <a:fillRect/>
                     </a:stretch>
@@ -1550,7 +1561,7 @@
                     <pic:cNvPicPr/>
                   </pic:nvPicPr>
                   <pic:blipFill>
-                    <a:blip r:embed="rId25"/>
+                    <a:blip r:embed="rId26"/>
                     <a:stretch>
                       <a:fillRect/>
                     </a:stretch>
@@ -1598,7 +1609,7 @@
                     <pic:cNvPicPr/>
                   </pic:nvPicPr>
                   <pic:blipFill>
-                    <a:blip r:embed="rId26"/>
+                    <a:blip r:embed="rId27"/>
                     <a:stretch>
                       <a:fillRect/>
                     </a:stretch>
@@ -1659,7 +1670,7 @@
                     <pic:cNvPicPr/>
                   </pic:nvPicPr>
                   <pic:blipFill>
-                    <a:blip r:embed="rId27"/>
+                    <a:blip r:embed="rId28"/>
                     <a:stretch>
                       <a:fillRect/>
                     </a:stretch>

</xml_diff>